<commit_message>
add functionality to power on/off an LG TV and audio receiver from a single desktop shortcut icon
</commit_message>
<xml_diff>
--- a/doc/design/media_control_system.docx
+++ b/doc/design/media_control_system.docx
@@ -13545,18 +13545,72 @@
         <w:t xml:space="preserve">  </w:t>
       </w:r>
       <w:r>
-        <w:t xml:space="preserve">Python is only needed if code modifications are needed.  The steps required </w:t>
+        <w:t>Python is only needed if code modifications are needed.  The steps required to authorize</w:t>
+      </w:r>
+      <w:r>
+        <w:t xml:space="preserve"> a host to cont</w:t>
+      </w:r>
+      <w:r>
+        <w:t xml:space="preserve">rol an LG TV are available in the </w:t>
+      </w:r>
+      <w:proofErr w:type="spellStart"/>
+      <w:r>
+        <w:t>mcs</w:t>
+      </w:r>
+      <w:proofErr w:type="spellEnd"/>
+      <w:r>
+        <w:t>/</w:t>
+      </w:r>
+      <w:proofErr w:type="spellStart"/>
+      <w:r>
+        <w:t>util</w:t>
+      </w:r>
+      <w:proofErr w:type="spellEnd"/>
+      <w:r>
+        <w:t>/</w:t>
+      </w:r>
+      <w:proofErr w:type="spellStart"/>
+      <w:r>
+        <w:t>lgtv</w:t>
+      </w:r>
+      <w:proofErr w:type="spellEnd"/>
+      <w:r>
+        <w:t>/readme.txt</w:t>
+      </w:r>
+      <w:r>
+        <w:t xml:space="preserve"> file</w:t>
+      </w:r>
+      <w:r>
+        <w:t>.</w:t>
+      </w:r>
+    </w:p>
+    <w:p/>
+    <w:p>
+      <w:r>
+        <w:t xml:space="preserve">Because the v2 system no longer has an IR remote, functionality was added to support turning on </w:t>
+      </w:r>
+      <w:r>
+        <w:t>the</w:t>
+      </w:r>
+      <w:r>
+        <w:t xml:space="preserve"> LG TV </w:t>
+      </w:r>
+      <w:proofErr w:type="gramStart"/>
+      <w:r>
+        <w:t xml:space="preserve">and  </w:t>
       </w:r>
       <w:bookmarkStart w:id="5" w:name="_GoBack"/>
       <w:bookmarkEnd w:id="5"/>
       <w:r>
-        <w:t>to authorize</w:t>
-      </w:r>
-      <w:r>
-        <w:t xml:space="preserve"> a host to cont</w:t>
-      </w:r>
-      <w:r>
-        <w:t xml:space="preserve">rol an LG TV are available in the </w:t>
+        <w:t>Audio</w:t>
+      </w:r>
+      <w:proofErr w:type="gramEnd"/>
+      <w:r>
+        <w:t xml:space="preserve"> Receiver simultaneously from a single remote desktop shortcut icon.  </w:t>
+      </w:r>
+      <w:r>
+        <w:br/>
+        <w:t xml:space="preserve">Please see the </w:t>
       </w:r>
       <w:proofErr w:type="spellStart"/>
       <w:r>
@@ -13576,17 +13630,11 @@
       </w:r>
       <w:proofErr w:type="spellStart"/>
       <w:r>
-        <w:t>lgtv</w:t>
+        <w:t>tvpower</w:t>
       </w:r>
       <w:proofErr w:type="spellEnd"/>
       <w:r>
-        <w:t>/readme.txt</w:t>
-      </w:r>
-      <w:r>
-        <w:t xml:space="preserve"> file</w:t>
-      </w:r>
-      <w:r>
-        <w:t>.</w:t>
+        <w:t>/schtask_acClientToggle.bat file for details.</w:t>
       </w:r>
       <w:r>
         <w:br w:type="page"/>
@@ -25560,7 +25608,7 @@
           <w:rPr>
             <w:noProof/>
           </w:rPr>
-          <w:t>6</w:t>
+          <w:t>21</w:t>
         </w:r>
         <w:r>
           <w:rPr>
@@ -27264,7 +27312,7 @@
 </file>
 
 <file path=customXml/itemProps1.xml><?xml version="1.0" encoding="utf-8"?>
-<ds:datastoreItem xmlns:ds="http://schemas.openxmlformats.org/officeDocument/2006/customXml" ds:itemID="{3999E464-D3C6-4CC3-8C62-A97F96DEA243}">
+<ds:datastoreItem xmlns:ds="http://schemas.openxmlformats.org/officeDocument/2006/customXml" ds:itemID="{9831B73C-1B10-49A9-8798-AF6A8A4FC9BE}">
   <ds:schemaRefs>
     <ds:schemaRef ds:uri="http://schemas.openxmlformats.org/officeDocument/2006/bibliography"/>
   </ds:schemaRefs>

</xml_diff>

<commit_message>
update documentation for version 2
</commit_message>
<xml_diff>
--- a/doc/design/media_control_system.docx
+++ b/doc/design/media_control_system.docx
@@ -1203,16 +1203,15 @@
         <w:t>Play media from</w:t>
       </w:r>
       <w:r>
-        <w:t xml:space="preserve"> any home computer</w:t>
-      </w:r>
-      <w:r>
-        <w:t xml:space="preserve"> using</w:t>
-      </w:r>
-      <w:r>
-        <w:t xml:space="preserve"> a single</w:t>
-      </w:r>
-      <w:r>
-        <w:t xml:space="preserve"> home theater</w:t>
+        <w:t xml:space="preserve"> any PC to a </w:t>
+      </w:r>
+      <w:proofErr w:type="spellStart"/>
+      <w:r>
+        <w:t>singe</w:t>
+      </w:r>
+      <w:proofErr w:type="spellEnd"/>
+      <w:r>
+        <w:t xml:space="preserve"> audio receiver</w:t>
       </w:r>
     </w:p>
     <w:p>
@@ -1230,7 +1229,16 @@
         <w:t xml:space="preserve"> </w:t>
       </w:r>
       <w:r>
-        <w:t>from a PC or smartphone</w:t>
+        <w:t xml:space="preserve">from </w:t>
+      </w:r>
+      <w:r>
+        <w:t xml:space="preserve">any </w:t>
+      </w:r>
+      <w:r>
+        <w:t xml:space="preserve">PC </w:t>
+      </w:r>
+      <w:r>
+        <w:t>on the local network</w:t>
       </w:r>
     </w:p>
     <w:p>
@@ -1245,7 +1253,16 @@
         <w:t xml:space="preserve">Consolidation to </w:t>
       </w:r>
       <w:r>
-        <w:t>a single universal remote</w:t>
+        <w:t xml:space="preserve">a single universal </w:t>
+      </w:r>
+      <w:r>
+        <w:t xml:space="preserve">IR </w:t>
+      </w:r>
+      <w:r>
+        <w:t>remote</w:t>
+      </w:r>
+      <w:r>
+        <w:t xml:space="preserve"> (v1) or wireless mouse (v2) </w:t>
       </w:r>
     </w:p>
     <w:p>
@@ -9531,7 +9548,9 @@
                               <w:r>
                                 <w:t xml:space="preserve"> Diagram v2</w:t>
                               </w:r>
+                              <w:bookmarkStart w:id="3" w:name="_GoBack"/>
                               <w:bookmarkEnd w:id="2"/>
+                              <w:bookmarkEnd w:id="3"/>
                             </w:p>
                           </w:txbxContent>
                         </wps:txbx>
@@ -12816,7 +12835,7 @@
                               <w:pPr>
                                 <w:pStyle w:val="Heading1"/>
                               </w:pPr>
-                              <w:bookmarkStart w:id="3" w:name="_Toc227679436"/>
+                              <w:bookmarkStart w:id="4" w:name="_Toc227679436"/>
                               <w:proofErr w:type="spellStart"/>
                               <w:r>
                                 <w:t>Xantech</w:t>
@@ -12825,7 +12844,7 @@
                               <w:r>
                                 <w:t xml:space="preserve"> Speaker Switch Matrix</w:t>
                               </w:r>
-                              <w:bookmarkEnd w:id="3"/>
+                              <w:bookmarkEnd w:id="4"/>
                             </w:p>
                           </w:txbxContent>
                         </wps:txbx>
@@ -13430,12 +13449,12 @@
       <w:pPr>
         <w:pStyle w:val="Heading1"/>
       </w:pPr>
-      <w:bookmarkStart w:id="4" w:name="_Toc227679437"/>
+      <w:bookmarkStart w:id="5" w:name="_Toc227679437"/>
       <w:r>
         <w:lastRenderedPageBreak/>
         <w:t>Media Control System Diagram v1 vs v2</w:t>
       </w:r>
-      <w:bookmarkEnd w:id="4"/>
+      <w:bookmarkEnd w:id="5"/>
     </w:p>
     <w:p>
       <w:r>
@@ -13597,12 +13616,7 @@
       </w:r>
       <w:proofErr w:type="gramStart"/>
       <w:r>
-        <w:t xml:space="preserve">and  </w:t>
-      </w:r>
-      <w:bookmarkStart w:id="5" w:name="_GoBack"/>
-      <w:bookmarkEnd w:id="5"/>
-      <w:r>
-        <w:t>Audio</w:t>
+        <w:t>and  Audio</w:t>
       </w:r>
       <w:proofErr w:type="gramEnd"/>
       <w:r>
@@ -27312,7 +27326,7 @@
 </file>
 
 <file path=customXml/itemProps1.xml><?xml version="1.0" encoding="utf-8"?>
-<ds:datastoreItem xmlns:ds="http://schemas.openxmlformats.org/officeDocument/2006/customXml" ds:itemID="{9831B73C-1B10-49A9-8798-AF6A8A4FC9BE}">
+<ds:datastoreItem xmlns:ds="http://schemas.openxmlformats.org/officeDocument/2006/customXml" ds:itemID="{24FE12A7-CDF6-4D40-BA50-3F69A5FE3127}">
   <ds:schemaRefs>
     <ds:schemaRef ds:uri="http://schemas.openxmlformats.org/officeDocument/2006/bibliography"/>
   </ds:schemaRefs>

</xml_diff>

<commit_message>
update readme.txt to toggle LG TV and audio receiver power remotely
</commit_message>
<xml_diff>
--- a/doc/design/media_control_system.docx
+++ b/doc/design/media_control_system.docx
@@ -1208,8 +1208,6 @@
       <w:r>
         <w:t>l</w:t>
       </w:r>
-      <w:bookmarkStart w:id="1" w:name="_GoBack"/>
-      <w:bookmarkEnd w:id="1"/>
       <w:r>
         <w:t>e audio receiver</w:t>
       </w:r>
@@ -4541,7 +4539,7 @@
                               <w:pPr>
                                 <w:pStyle w:val="Heading1"/>
                               </w:pPr>
-                              <w:bookmarkStart w:id="2" w:name="_Toc227679434"/>
+                              <w:bookmarkStart w:id="1" w:name="_Toc227679434"/>
                               <w:r>
                                 <w:t>Media Control System</w:t>
                               </w:r>
@@ -4551,7 +4549,7 @@
                               <w:r>
                                 <w:t xml:space="preserve"> v1</w:t>
                               </w:r>
-                              <w:bookmarkEnd w:id="2"/>
+                              <w:bookmarkEnd w:id="1"/>
                             </w:p>
                           </w:txbxContent>
                         </wps:txbx>
@@ -9541,14 +9539,14 @@
                               <w:pPr>
                                 <w:pStyle w:val="Heading1"/>
                               </w:pPr>
-                              <w:bookmarkStart w:id="3" w:name="_Toc227679435"/>
+                              <w:bookmarkStart w:id="2" w:name="_Toc227679435"/>
                               <w:r>
                                 <w:t>Media Control System</w:t>
                               </w:r>
                               <w:r>
                                 <w:t xml:space="preserve"> Diagram v2</w:t>
                               </w:r>
-                              <w:bookmarkEnd w:id="3"/>
+                              <w:bookmarkEnd w:id="2"/>
                             </w:p>
                           </w:txbxContent>
                         </wps:txbx>
@@ -12833,7 +12831,7 @@
                               <w:pPr>
                                 <w:pStyle w:val="Heading1"/>
                               </w:pPr>
-                              <w:bookmarkStart w:id="4" w:name="_Toc227679436"/>
+                              <w:bookmarkStart w:id="3" w:name="_Toc227679436"/>
                               <w:proofErr w:type="spellStart"/>
                               <w:r>
                                 <w:t>Xantech</w:t>
@@ -12842,7 +12840,7 @@
                               <w:r>
                                 <w:t xml:space="preserve"> Speaker Switch Matrix</w:t>
                               </w:r>
-                              <w:bookmarkEnd w:id="4"/>
+                              <w:bookmarkEnd w:id="3"/>
                             </w:p>
                           </w:txbxContent>
                         </wps:txbx>
@@ -13447,12 +13445,12 @@
       <w:pPr>
         <w:pStyle w:val="Heading1"/>
       </w:pPr>
-      <w:bookmarkStart w:id="5" w:name="_Toc227679437"/>
+      <w:bookmarkStart w:id="4" w:name="_Toc227679437"/>
       <w:r>
         <w:lastRenderedPageBreak/>
         <w:t>Media Control System Diagram v1 vs v2</w:t>
       </w:r>
-      <w:bookmarkEnd w:id="5"/>
+      <w:bookmarkEnd w:id="4"/>
     </w:p>
     <w:p>
       <w:r>
@@ -13642,11 +13640,19 @@
       </w:r>
       <w:proofErr w:type="spellStart"/>
       <w:r>
-        <w:t>tvpower</w:t>
+        <w:t>tv</w:t>
+      </w:r>
+      <w:r>
+        <w:t>power</w:t>
       </w:r>
       <w:proofErr w:type="spellEnd"/>
       <w:r>
-        <w:t>/schtask_acClientToggle.bat file for details.</w:t>
+        <w:t>/readme.txt</w:t>
+      </w:r>
+      <w:bookmarkStart w:id="5" w:name="_GoBack"/>
+      <w:bookmarkEnd w:id="5"/>
+      <w:r>
+        <w:t xml:space="preserve"> file for details.</w:t>
       </w:r>
       <w:r>
         <w:br w:type="page"/>
@@ -27324,7 +27330,7 @@
 </file>
 
 <file path=customXml/itemProps1.xml><?xml version="1.0" encoding="utf-8"?>
-<ds:datastoreItem xmlns:ds="http://schemas.openxmlformats.org/officeDocument/2006/customXml" ds:itemID="{9A4D1A33-6AB5-4302-A8DE-36605ADE9FDA}">
+<ds:datastoreItem xmlns:ds="http://schemas.openxmlformats.org/officeDocument/2006/customXml" ds:itemID="{13F4A916-F5C1-4622-B2B3-4BFEE0E8CB28}">
   <ds:schemaRefs>
     <ds:schemaRef ds:uri="http://schemas.openxmlformats.org/officeDocument/2006/bibliography"/>
   </ds:schemaRefs>

</xml_diff>